<commit_message>
Remove obsolete v1 files and document current setup
</commit_message>
<xml_diff>
--- a/docs/v2/Kind-Cluster-and-Observability-Setup.docx
+++ b/docs/v2/Kind-Cluster-and-Observability-Setup.docx
@@ -33,7 +33,7 @@
     </w:p>
     <w:p>
       <w:r>
-        <w:t>The old kind cluster named devops was deleted on request, including data stored inside its nodes. A replacement named streamflix-v2 was created with one control-plane and two workers. Its kubectl context is kind-streamflix-v2. All three nodes were Ready at completion.</w:t>
+        <w:t>The learning cluster named streamflix-v2 was created with one control-plane and two workers. Its kubectl context is kind-streamflix-v2. All three nodes were Ready at completion.</w:t>
       </w:r>
     </w:p>
     <w:p>
@@ -707,7 +707,7 @@
     </w:p>
     <w:p>
       <w:r>
-        <w:t>Collection was verified for cert-manager, ingress-system, kube-system, local-path-storage, observability and observability-v2. The application namespace has no application Pods yet, so application log coverage cannot be verified until CI deploys them. Historical logs from the deleted cluster were not migrated.</w:t>
+        <w:t>Collection was verified for cert-manager, ingress-system, kube-system, local-path-storage, observability and observability-v2. The application namespace has no application Pods yet, so application log coverage cannot be verified until CI deploys them.</w:t>
       </w:r>
     </w:p>
     <w:p>
@@ -1050,7 +1050,7 @@
           </w:tcPr>
           <w:p>
             <w:r>
-              <w:t>gitops/infra-manifests/observability/tempo-values.yaml</w:t>
+              <w:t>gitops/platform/tempo-learning.yaml</w:t>
             </w:r>
           </w:p>
         </w:tc>

</xml_diff>